<commit_message>
day1 physical setup ready to install Alma linux
</commit_message>
<xml_diff>
--- a/my web server journal.docx
+++ b/my web server journal.docx
@@ -29,17 +29,179 @@
           <w:u w:val="single"/>
         </w:rPr>
       </w:pPr>
+      <w:r>
+        <w:rPr>
+          <w:sz w:val="36"/>
+          <w:szCs w:val="36"/>
+          <w:u w:val="single"/>
+        </w:rPr>
+        <w:t>Day1</w:t>
+      </w:r>
+      <w:bookmarkStart w:id="0" w:name="_GoBack"/>
+      <w:bookmarkEnd w:id="0"/>
     </w:p>
     <w:p>
       <w:pPr>
+        <w:jc w:val="both"/>
+        <w:rPr>
+          <w:sz w:val="24"/>
+          <w:szCs w:val="24"/>
+        </w:rPr>
+      </w:pPr>
+      <w:r>
+        <w:rPr>
+          <w:sz w:val="24"/>
+          <w:szCs w:val="24"/>
+        </w:rPr>
+        <w:t xml:space="preserve">I </w:t>
+      </w:r>
+      <w:r>
+        <w:rPr>
+          <w:sz w:val="24"/>
+          <w:szCs w:val="24"/>
+        </w:rPr>
+        <w:t xml:space="preserve">am trying to create a web server in my old PC.  This PC was gifted to me by my father at age of </w:t>
+      </w:r>
+      <w:proofErr w:type="gramStart"/>
+      <w:r>
+        <w:rPr>
+          <w:sz w:val="24"/>
+          <w:szCs w:val="24"/>
+        </w:rPr>
+        <w:t>12 .</w:t>
+      </w:r>
+      <w:proofErr w:type="gramEnd"/>
+      <w:r>
+        <w:rPr>
+          <w:sz w:val="24"/>
+          <w:szCs w:val="24"/>
+        </w:rPr>
+        <w:t xml:space="preserve">    This PC already </w:t>
+      </w:r>
+      <w:proofErr w:type="gramStart"/>
+      <w:r>
+        <w:rPr>
+          <w:sz w:val="24"/>
+          <w:szCs w:val="24"/>
+        </w:rPr>
+        <w:t>has  Linux</w:t>
+      </w:r>
+      <w:proofErr w:type="gramEnd"/>
+      <w:r>
+        <w:rPr>
+          <w:sz w:val="24"/>
+          <w:szCs w:val="24"/>
+        </w:rPr>
+        <w:t xml:space="preserve"> in it , but password  not known.  </w:t>
+      </w:r>
+      <w:proofErr w:type="gramStart"/>
+      <w:r>
+        <w:rPr>
+          <w:sz w:val="24"/>
+          <w:szCs w:val="24"/>
+        </w:rPr>
+        <w:t>So</w:t>
+      </w:r>
+      <w:proofErr w:type="gramEnd"/>
+      <w:r>
+        <w:rPr>
+          <w:sz w:val="24"/>
+          <w:szCs w:val="24"/>
+        </w:rPr>
+        <w:t xml:space="preserve"> I know this is going to work. </w:t>
+      </w:r>
+      <w:proofErr w:type="gramStart"/>
+      <w:r>
+        <w:rPr>
+          <w:sz w:val="24"/>
+          <w:szCs w:val="24"/>
+        </w:rPr>
+        <w:t>But  still</w:t>
+      </w:r>
+      <w:proofErr w:type="gramEnd"/>
+      <w:r>
+        <w:rPr>
+          <w:sz w:val="24"/>
+          <w:szCs w:val="24"/>
+        </w:rPr>
+        <w:t xml:space="preserve"> I am trying to install </w:t>
+      </w:r>
+      <w:proofErr w:type="spellStart"/>
+      <w:r>
+        <w:rPr>
+          <w:sz w:val="24"/>
+          <w:szCs w:val="24"/>
+        </w:rPr>
+        <w:t>AlmaLinux</w:t>
+      </w:r>
+      <w:proofErr w:type="spellEnd"/>
+      <w:r>
+        <w:rPr>
+          <w:sz w:val="24"/>
+          <w:szCs w:val="24"/>
+        </w:rPr>
+        <w:t xml:space="preserve"> 10 minimal in it</w:t>
+      </w:r>
+      <w:r>
+        <w:rPr>
+          <w:sz w:val="24"/>
+          <w:szCs w:val="24"/>
+        </w:rPr>
+        <w:t xml:space="preserve"> to have  system admin experiences.</w:t>
+      </w:r>
+      <w:r>
+        <w:rPr>
+          <w:sz w:val="24"/>
+          <w:szCs w:val="24"/>
+        </w:rPr>
+        <w:t xml:space="preserve"> </w:t>
+      </w:r>
+      <w:proofErr w:type="spellStart"/>
+      <w:proofErr w:type="gramStart"/>
+      <w:r>
+        <w:rPr>
+          <w:sz w:val="24"/>
+          <w:szCs w:val="24"/>
+        </w:rPr>
+        <w:t>Lets</w:t>
+      </w:r>
+      <w:proofErr w:type="spellEnd"/>
+      <w:proofErr w:type="gramEnd"/>
+      <w:r>
+        <w:rPr>
+          <w:sz w:val="24"/>
+          <w:szCs w:val="24"/>
+        </w:rPr>
+        <w:t xml:space="preserve"> see what happens.</w:t>
+      </w:r>
+    </w:p>
+    <w:p>
+      <w:pPr>
+        <w:jc w:val="both"/>
+        <w:rPr>
+          <w:sz w:val="24"/>
+          <w:szCs w:val="24"/>
+        </w:rPr>
+      </w:pPr>
+    </w:p>
+    <w:p>
+      <w:pPr>
+        <w:jc w:val="center"/>
         <w:rPr>
           <w:sz w:val="36"/>
           <w:szCs w:val="36"/>
           <w:u w:val="single"/>
         </w:rPr>
       </w:pPr>
-      <w:bookmarkStart w:id="0" w:name="_GoBack"/>
-      <w:bookmarkEnd w:id="0"/>
+    </w:p>
+    <w:p>
+      <w:pPr>
+        <w:rPr>
+          <w:sz w:val="36"/>
+          <w:szCs w:val="36"/>
+          <w:u w:val="single"/>
+        </w:rPr>
+      </w:pPr>
     </w:p>
     <w:sectPr>
       <w:pgSz w:w="12240" w:h="15840"/>

</xml_diff>